<commit_message>
Update faculty publishing guides for versioned Composer builds
</commit_message>
<xml_diff>
--- a/downloads/resources/faculty-composer-quick-start-guide.docx
+++ b/downloads/resources/faculty-composer-quick-start-guide.docx
@@ -55,11 +55,7 @@
         <w:spacing w:after="80"/>
       </w:pPr>
       <w:r>
-        <w:rPr>
-          <w:color w:val="000000"/>
-          <w:u w:val="none"/>
-        </w:rPr>
-        <w:t>Composer + LMS Quick Start</w:t>
+        <w:t>Composer and LMS Quick Start</w:t>
       </w:r>
     </w:p>
     <w:p>
@@ -68,7 +64,7 @@
         <w:spacing w:after="240"/>
       </w:pPr>
       <w:r>
-        <w:t>Build an economics Mastery Quest, publish its self-contained game HTML, and place the game in your LMS.</w:t>
+        <w:t>Build an economics game, publish its package, and copy the embed for the version you want students to use.</w:t>
       </w:r>
     </w:p>
     <w:tbl>
@@ -98,7 +94,7 @@
           </w:tcPr>
           <w:p>
             <w:r>
-              <w:t>Fast path: Choose a course area, concepts, and learning-outcome coverage, then enable the modes you want, choose an official theme or optional custom images, review Readiness, Generate, and publish the self-contained game HTML. Concept Reviews open from the Mastery Quests web library when recommended. No JavaScript editing is required.</w:t>
+              <w:t>Fast path: Choose concepts and learning-outcome coverage, select modes and appearance, check Readiness, and download the ZIP. Upload the supplied launcher and unique game file, verify the build, then copy its Canvas embed. No JavaScript editing is required.</w:t>
             </w:r>
           </w:p>
         </w:tc>
@@ -217,23 +213,13 @@
             </w:pPr>
             <w:r>
               <w:rPr>
-                <w:rFonts w:ascii="Aptos" w:hAnsi="Aptos"/>
                 <w:b/>
-                <w:color w:val="062454"/>
-                <w:sz w:val="22"/>
               </w:rPr>
               <w:t>Game details</w:t>
             </w:r>
             <w:r>
               <w:br/>
-            </w:r>
-            <w:r>
-              <w:rPr>
-                <w:rFonts w:ascii="Aptos" w:hAnsi="Aptos"/>
-                <w:color w:val="0A172A"/>
-                <w:sz w:val="20"/>
-              </w:rPr>
-              <w:t>Give the game a student-facing title. Keep or edit the lowercase file name.</w:t>
+              <w:t>Give the game a title and file name. To create another assignment with these settings, choose Start a different game.</w:t>
             </w:r>
           </w:p>
         </w:tc>
@@ -533,9 +519,7 @@
             </w:r>
             <w:r>
               <w:br/>
-            </w:r>
-            <w:r>
-              <w:t>Download the ZIP. Keep the composition recipe and faculty build records for later revisions.</w:t>
+              <w:t>Download the ZIP and keep its recipe. Each download creates a new Build ID and game filename.</w:t>
             </w:r>
           </w:p>
         </w:tc>
@@ -561,7 +545,7 @@
         <w:ind w:left="360" w:hanging="173"/>
       </w:pPr>
       <w:r>
-        <w:t>The generated .html file - the game; graph images, selected official or custom artwork, and runtime logic are embedded.</w:t>
+        <w:t>game-mqb-….html - the uniquely named game, with its runtime, questions, graphs, and artwork embedded. Keep its filename unchanged.</w:t>
       </w:r>
     </w:p>
     <w:p>
@@ -571,12 +555,7 @@
         <w:ind w:left="360" w:hanging="173"/>
       </w:pPr>
       <w:r>
-        <w:rPr>
-          <w:rFonts w:ascii="Aptos" w:hAnsi="Aptos"/>
-          <w:color w:val="0A172A"/>
-          <w:sz w:val="21"/>
-        </w:rPr>
-        <w:t>composition_recipe.json — reopen the same concept and mode selections later.</w:t>
+        <w:t>composition_recipe.json - import this to reopen the same Game ID and settings for an update.</w:t>
       </w:r>
     </w:p>
     <w:p>
@@ -586,12 +565,7 @@
         <w:ind w:left="360" w:hanging="173"/>
       </w:pPr>
       <w:r>
-        <w:rPr>
-          <w:rFonts w:ascii="Aptos" w:hAnsi="Aptos"/>
-          <w:color w:val="0A172A"/>
-          <w:sz w:val="21"/>
-        </w:rPr>
-        <w:t>composition_manifest.json — a record of what was included in the build.</w:t>
+        <w:t>composition_manifest.json - the Game ID, Build ID, and contents of this download.</w:t>
       </w:r>
     </w:p>
     <w:p>
@@ -601,7 +575,15 @@
         <w:ind w:left="360" w:hanging="173"/>
       </w:pPr>
       <w:r>
-        <w:t>README.txt - current build and deployment notes.</w:t>
+        <w:t>index.html - the supplied launcher; upload it beside the unique game file.</w:t>
+      </w:r>
+    </w:p>
+    <w:p>
+      <w:pPr>
+        <w:pStyle w:val="ListBullet"/>
+      </w:pPr>
+      <w:r>
+        <w:t>publish.html and README.txt - an offline embed helper and publishing instructions to keep with your records.</w:t>
       </w:r>
     </w:p>
     <w:p>
@@ -639,7 +621,7 @@
           </w:tcPr>
           <w:p>
             <w:r>
-              <w:t>Publish the generated game HTML. The recipe, composition manifest, and README are faculty records and do not need to be hosted. When the report recommends a Concept Review, the game opens the corresponding PDF from the Mastery Quests web library.</w:t>
+              <w:t>Upload the supplied index.html launcher and game-mqb-….html together. Keep both names. The recipe, manifest, publish.html, and README can stay with your faculty records. Concept Review PDFs remain in the Mastery Quests web library.</w:t>
             </w:r>
           </w:p>
         </w:tc>
@@ -708,9 +690,14 @@
           </w:tcPr>
           <w:p>
             <w:r>
+              <w:rPr>
+                <w:b/>
+              </w:rPr>
               <w:t>Extract the ZIP</w:t>
+            </w:r>
+            <w:r>
               <w:br/>
-              <w:t>Locate the generated HTML file. The other ZIP files are faculty build records.</w:t>
+              <w:t>Locate index.html and the unique game-mqb-….html file. Keep the rest of the package for revisions and publishing help.</w:t>
             </w:r>
           </w:p>
         </w:tc>
@@ -758,23 +745,13 @@
             </w:pPr>
             <w:r>
               <w:rPr>
-                <w:rFonts w:ascii="Aptos" w:hAnsi="Aptos"/>
                 <w:b/>
-                <w:color w:val="062454"/>
-                <w:sz w:val="22"/>
               </w:rPr>
-              <w:t>Rename it index.html</w:t>
+              <w:t>Keep the generated filenames</w:t>
             </w:r>
             <w:r>
               <w:br/>
-            </w:r>
-            <w:r>
-              <w:rPr>
-                <w:rFonts w:ascii="Aptos" w:hAnsi="Aptos"/>
-                <w:color w:val="0A172A"/>
-                <w:sz w:val="20"/>
-              </w:rPr>
-              <w:t>This is optional, but it gives you the cleanest public URL.</w:t>
+              <w:t>The launcher opens its matching game. Renaming or omitting that unique game file breaks the link.</w:t>
             </w:r>
           </w:p>
         </w:tc>
@@ -818,9 +795,14 @@
           </w:tcPr>
           <w:p>
             <w:r>
-              <w:t>Upload the game HTML</w:t>
+              <w:rPr>
+                <w:b/>
+              </w:rPr>
+              <w:t>Upload both files</w:t>
+            </w:r>
+            <w:r>
               <w:br/>
-              <w:t>Place index.html at the publishing root. No sibling Concept Review folder is required.</w:t>
+              <w:t>Place the launcher and game in the same publishing folder. Preserve older game files still used by assignments.</w:t>
             </w:r>
           </w:p>
         </w:tc>
@@ -932,22 +914,13 @@
             </w:pPr>
             <w:r>
               <w:rPr>
-                <w:rFonts w:ascii="Aptos" w:hAnsi="Aptos"/>
                 <w:b/>
-                <w:color w:val="062454"/>
-                <w:sz w:val="22"/>
               </w:rPr>
-              <w:t>Test the public URL</w:t>
+              <w:t>Verify the downloaded build</w:t>
+            </w:r>
+            <w:r>
               <w:br/>
-              <w:t>Open the Pages URL in a private browser window and run the game before adding it to your LMS.</w:t>
-            </w:r>
-            <w:r/>
-            <w:r>
-              <w:rPr>
-                <w:rFonts w:ascii="Aptos" w:hAnsi="Aptos"/>
-                <w:color w:val="0A172A"/>
-                <w:sz w:val="20"/>
-              </w:rPr>
+              <w:t>Wait for deployment. Enter the public folder URL in Generate or publish.html. Open the Versioned game URL and check Game build information against the manifest.</w:t>
             </w:r>
           </w:p>
         </w:tc>
@@ -993,7 +966,7 @@
           </w:tcPr>
           <w:p>
             <w:r>
-              <w:t>The hosted index.html is the game. Add its public HTTPS URL to your LMS as an external link, or embed it if your LMS and institution permit external iframe content. No second wrapper file is required. Concept Reviews open from the Mastery Quests web library when recommended.</w:t>
+              <w:t>Enter your published folder URL, for example https://wjbyrd.github.io/test/, in Generate or the downloaded publish.html. The helper fills in the actual game filename and version automatically.</w:t>
             </w:r>
           </w:p>
         </w:tc>
@@ -1009,26 +982,7 @@
         <w:ind w:left="288" w:right="288"/>
       </w:pPr>
       <w:r>
-        <w:rPr>
-          <w:rFonts w:ascii="Consolas" w:hAnsi="Consolas"/>
-          <w:color w:val="0A172A"/>
-          <w:sz w:val="17"/>
-        </w:rPr>
-        <w:t>&lt;iframe title="Mastery Quest game"</w:t>
-        <w:br/>
-        <w:t xml:space="preserve">  src="https://YOURUSERNAME.github.io/YOUR-REPO/"</w:t>
-        <w:br/>
-        <w:t xml:space="preserve">  width="100%"</w:t>
-        <w:br/>
-        <w:t xml:space="preserve">  height="900"</w:t>
-        <w:br/>
-        <w:t xml:space="preserve">  style="border:0;"</w:t>
-        <w:br/>
-        <w:t xml:space="preserve">  loading="lazy"</w:t>
-        <w:br/>
-        <w:t xml:space="preserve">  allowfullscreen&gt;</w:t>
-        <w:br/>
-        <w:t>&lt;/iframe&gt;</w:t>
+        <w:t>Choose Copy Canvas embed HTML and paste the complete code into the Canvas page's HTML editor. The separate Versioned game URL is for an external course link. Use the generated fields; do not type a Build ID yourself.</w:t>
       </w:r>
     </w:p>
     <w:p>
@@ -1038,12 +992,7 @@
         <w:ind w:left="360" w:hanging="173"/>
       </w:pPr>
       <w:r>
-        <w:rPr>
-          <w:rFonts w:ascii="Aptos" w:hAnsi="Aptos"/>
-          <w:color w:val="0A172A"/>
-          <w:sz w:val="21"/>
-        </w:rPr>
-        <w:t>For a link, add the public GitHub Pages URL using your LMS's normal link or module tool. For an embed, open the LMS HTML/source editor if one is available.</w:t>
+        <w:t>For an external link, copy the Versioned game URL into the LMS module, assignment, or resource.</w:t>
       </w:r>
     </w:p>
     <w:p>
@@ -1053,12 +1002,7 @@
         <w:ind w:left="360" w:hanging="173"/>
       </w:pPr>
       <w:r>
-        <w:rPr>
-          <w:rFonts w:ascii="Aptos" w:hAnsi="Aptos"/>
-          <w:color w:val="0A172A"/>
-          <w:sz w:val="21"/>
-        </w:rPr>
-        <w:t>For an embed, replace the example src with the public GitHub Pages game URL.</w:t>
+        <w:t>For an embed, save the generated iframe code in the LMS HTML editor. Other platforms may also support this iframe.</w:t>
       </w:r>
     </w:p>
     <w:p>
@@ -1096,13 +1040,46 @@
         <w:pStyle w:val="ListBullet"/>
       </w:pPr>
       <w:r>
-        <w:t>If the LMS or institution blocks external iframes, use the same public HTTPS URL as an external course link.</w:t>
+        <w:t>If the LMS blocks external iframes, use the same versioned HTTPS game URL as an external course link.</w:t>
       </w:r>
     </w:p>
     <w:p>
       <w:pPr>
         <w:pStyle w:val="Heading2"/>
         <w:pageBreakBefore/>
+      </w:pPr>
+      <w:r>
+        <w:t>Update a game or publish another</w:t>
+      </w:r>
+    </w:p>
+    <w:p>
+      <w:pPr/>
+      <w:r>
+        <w:t>Update the same game: Import its saved composition recipe, edit, and generate a new package. The Game ID stays the same; the Build ID changes. Upload the new game file and launcher, wait for deployment, and verify the new versioned URL. Replace the Canvas iframe HTML or external course link. The Composer cannot update Canvas automatically.</w:t>
+      </w:r>
+    </w:p>
+    <w:p>
+      <w:pPr/>
+      <w:r>
+        <w:t>Publish a different game: Choose Start a different game in Game details. Use separate folders such as game-one/ and game-two/ to keep assignments available. Keep earlier game files while assignments still link to them; deleting a file breaks its existing link.</w:t>
+      </w:r>
+    </w:p>
+    <w:p>
+      <w:pPr/>
+      <w:r>
+        <w:t>Saved progress: Compatible saves can survive updates to the same game. Changed questions, graphs, or checkpoint routes use separate save slots and leave earlier saves intact. Keep the original game available for those saves. Legacy recipes receive a new Game ID, so retain the old game for its legacy progress.</w:t>
+      </w:r>
+    </w:p>
+    <w:p>
+      <w:pPr/>
+      <w:r>
+        <w:t>If an older game appears: Open the newest package's publish.html, enter the correct folder URL, and verify Game build information against the manifest. Replace the course link or embed. An unchanged iframe can still show an earlier build. Do not clear student browser storage to fix a publishing problem.</w:t>
+      </w:r>
+    </w:p>
+    <w:p>
+      <w:pPr>
+        <w:pStyle w:val="Heading2"/>
+        <w:pageBreakBefore w:val="0"/>
       </w:pPr>
       <w:r>
         <w:t>Before you assign it</w:t>
@@ -1208,7 +1185,7 @@
     </w:p>
     <w:p>
       <w:r>
-        <w:t>Current guidance: https://masteryquests.org/how-to/composer/ | Learning outcomes: https://masteryquests.org/how-to/learning-outcomes/ | Manual authoring and validation: https://masteryquests.org/downloads/resources/manual-faculty-guide.html</w:t>
+        <w:t>Current guidance: https://masteryquests.org/how-to/composer/ | Publishing and updates: https://masteryquests.org/how-to/canvas/ | Learning outcomes: https://masteryquests.org/how-to/learning-outcomes/</w:t>
       </w:r>
     </w:p>
     <w:sectPr>

</xml_diff>